<commit_message>
EGCH 01-09-2026 edition: print the weighted central, read the bibliography from the register
- The valuation summary, READ FIRST, section 1.5 and the Summary sheet now
  carry the weighted central (EGP 3.76) with its weights stated, inside the
  published field, never as a point target.
- The bibliography's market table reads the register exclusively; the stale
  live_data.json read and the unconsumed erp_cds input are gone, so the
  superseded 9.42% CDS premium no longer prints anywhere.
- prose_check.py matches prose figures against consumed register values only.
- Section 1.8 states the FX-leg disclosure in the study's own words with the
  floored alternative priced beside it; section 3 adds record strength and
  width ratio from the band record; terminal cost-of-debt labels computed.

Fair value unchanged: 0.00 / 3.76 / 15.47.

Co-Authored-By: Claude Fable 5.1 <noreply@anthropic.com>
Claude-Session: https://claude.ai/code/session_01CUBWMwER6i6M5VJH7eDW4Q
</commit_message>
<xml_diff>
--- a/engine/egch_study/EGCH_Bibliography_01-09-2026.docx
+++ b/engine/egch_study/EGCH_Bibliography_01-09-2026.docx
@@ -1815,7 +1815,7 @@
                 <w:color w:val="1C3A36"/>
                 <w:sz w:val="16"/>
               </w:rPr>
-              <w:t>Same workbook</w:t>
+              <w:t>Same workbook: the total rating-basis premium less the mature-market premium</w:t>
             </w:r>
           </w:p>
         </w:tc>
@@ -1871,7 +1871,7 @@
                 <w:color w:val="1C3A36"/>
                 <w:sz w:val="16"/>
               </w:rPr>
-              <w:t>13.94% (rating) / 9.42% (CDS)</w:t>
+              <w:t>13.94% (rating) / 9.41% (CDS)</w:t>
             </w:r>
           </w:p>
         </w:tc>
@@ -2239,7 +2239,7 @@
                 <w:color w:val="1C3A36"/>
                 <w:sz w:val="16"/>
               </w:rPr>
-              <w:t>19.00 / 20.00% corridor</w:t>
+              <w:t>19.50% main operation rate, mid-corridor</w:t>
             </w:r>
           </w:p>
         </w:tc>
@@ -21199,7 +21199,7 @@
                 <w:color w:val="1C3A36"/>
                 <w:sz w:val="14"/>
               </w:rPr>
-              <w:t>erp_cds</w:t>
+              <w:t>country_risk_premium_rating</w:t>
             </w:r>
           </w:p>
         </w:tc>
@@ -21217,7 +21217,7 @@
                 <w:color w:val="1C3A36"/>
                 <w:sz w:val="14"/>
               </w:rPr>
-              <w:t>0.0942</w:t>
+              <w:t>0.0971</w:t>
             </w:r>
           </w:p>
         </w:tc>
@@ -21271,7 +21271,7 @@
                 <w:color w:val="1C3A36"/>
                 <w:sz w:val="14"/>
               </w:rPr>
-              <w:t>Country risk premium workbook, original file, Egypt row, CDS basis total equity risk premium</w:t>
+              <w:t>DERIVED: erp_rating - mature_market_erp, the country component of the rating-basis equity premium (the workbook's own construction, recomputed rather than read from a second file)</w:t>
             </w:r>
           </w:p>
         </w:tc>
@@ -29250,7 +29250,7 @@
                 <w:color w:val="1C3A36"/>
                 <w:sz w:val="14"/>
               </w:rPr>
-              <w:t>2026-08-08</w:t>
+              <w:t>2026-09-01</w:t>
             </w:r>
           </w:p>
         </w:tc>
@@ -29268,7 +29268,7 @@
                 <w:color w:val="1C3A36"/>
                 <w:sz w:val="14"/>
               </w:rPr>
-              <w:t>Weights of the four lenses in the published central: cash flow (programme carried through) 45%, relative multiples 20%, normalised earnings 20%, book value 15% — the same weights the 08-08-2026 edition published. The bear and full readings are the low and high of the field across every lens, never the weighted extremes.</w:t>
+              <w:t>Weights of the four lenses in the weighted central this edition publishes inside its field: cash flow with the programme carried through 45%, relative multiples 20%, normalised earnings 20%, book value 15%. SET IN THIS EDITION (1 September 2026): the 08-08-2026 edition published the field alone, with no central and no weights. Basis: the cash-flow lens is the primary lens and the only one that charges the capital programme, so it carries the largest weight; its carried-through side enters because that is the company's own stated plan, and the stopped side is published beside it as the contested judgement, never averaged in; the relative and normalised lenses are cross-checks at equal weight; book value, which prices what has been paid for rather than what it earns, the least. The bear and full readings are the low and high of the field across every lens, never the weighted extremes.</w:t>
             </w:r>
           </w:p>
         </w:tc>

</xml_diff>

<commit_message>
EGCH QC gate, third pass: DELIVERABLE; close its caveats
The outside auditor's third pass clears both second-pass blockers and rates
the 01-09-2026 edition deliverable. Its non-blocking caveats closed here:
bibliography list values no longer render in scientific notation; the
stale live_data.json and the retired 08-08 workbook builder that read it
are removed (no run_all stage read either); the terminal cost-of-debt
figure is labelled correctly in the Driver Ledger and the gap review
(11.77% on the dollar leg, 11.79% blended). Edition rebuilt end to end:
recalc 628/628, prose 367/0, scrub 0 hits, all four asserts pass, central
unchanged at 3.76.

Co-Authored-By: Claude Fable 5.1 <noreply@anthropic.com>
Claude-Session: https://claude.ai/code/session_01CUBWMwER6i6M5VJH7eDW4Q
</commit_message>
<xml_diff>
--- a/engine/egch_study/EGCH_Bibliography_01-09-2026.docx
+++ b/engine/egch_study/EGCH_Bibliography_01-09-2026.docx
@@ -26270,7 +26270,7 @@
                 <w:color w:val="1C3A36"/>
                 <w:sz w:val="14"/>
               </w:rPr>
-              <w:t>2.6e+04, 2.6e+04, 2.6e+04, 2.6e+04, 2.6e+04</w:t>
+              <w:t>26000, 26000, 26000, 26000, 26000</w:t>
             </w:r>
           </w:p>
         </w:tc>
@@ -29490,7 +29490,7 @@
                 <w:color w:val="1C3A36"/>
                 <w:sz w:val="14"/>
               </w:rPr>
-              <w:t>4e+04, 4.1e+04, 4.2e+04, 4.3e+04, 4.4e+04</w:t>
+              <w:t>40000, 41000, 42000, 43000, 44000</w:t>
             </w:r>
           </w:p>
         </w:tc>
@@ -30962,7 +30962,7 @@
                 <w:color w:val="1C3A36"/>
                 <w:sz w:val="14"/>
               </w:rPr>
-              <w:t>7,526, 8,429, 9,272, 1.011e+04, 1.092e+04</w:t>
+              <w:t>7,526, 8,429, 9,272, 10,106, 10,915</w:t>
             </w:r>
           </w:p>
         </w:tc>
@@ -31146,7 +31146,7 @@
                 <w:color w:val="1C3A36"/>
                 <w:sz w:val="14"/>
               </w:rPr>
-              <w:t>1.55e+05, 1.6e+05, 1.65e+05, 1.7e+05, 1.75e+05</w:t>
+              <w:t>155000, 160000, 165000, 170000, 175000</w:t>
             </w:r>
           </w:p>
         </w:tc>

</xml_diff>